<commit_message>
tinggal tik deui tah
</commit_message>
<xml_diff>
--- a/Todo 28042025/revision2/Checklist.docx
+++ b/Todo 28042025/revision2/Checklist.docx
@@ -1,6 +1,6 @@
 
 <file path=word/document.xml><?xml version="1.0" encoding="utf-8"?>
-<w:document xmlns:wpc="http://schemas.microsoft.com/office/word/2010/wordprocessingCanvas" xmlns:cx="http://schemas.microsoft.com/office/drawing/2014/chartex" xmlns:cx1="http://schemas.microsoft.com/office/drawing/2015/9/8/chartex" xmlns:mc="http://schemas.openxmlformats.org/markup-compatibility/2006" xmlns:o="urn:schemas-microsoft-com:office:office" xmlns:r="http://schemas.openxmlformats.org/officeDocument/2006/relationships" xmlns:m="http://schemas.openxmlformats.org/officeDocument/2006/math" xmlns:v="urn:schemas-microsoft-com:vml" xmlns:wp14="http://schemas.microsoft.com/office/word/2010/wordprocessingDrawing" xmlns:wp="http://schemas.openxmlformats.org/drawingml/2006/wordprocessingDrawing" xmlns:w10="urn:schemas-microsoft-com:office:word" xmlns:w="http://schemas.openxmlformats.org/wordprocessingml/2006/main" xmlns:w14="http://schemas.microsoft.com/office/word/2010/wordml" xmlns:w15="http://schemas.microsoft.com/office/word/2012/wordml" xmlns:w16se="http://schemas.microsoft.com/office/word/2015/wordml/symex" xmlns:wpg="http://schemas.microsoft.com/office/word/2010/wordprocessingGroup" xmlns:wpi="http://schemas.microsoft.com/office/word/2010/wordprocessingInk" xmlns:wne="http://schemas.microsoft.com/office/word/2006/wordml" xmlns:wps="http://schemas.microsoft.com/office/word/2010/wordprocessingShape" mc:Ignorable="w14 w15 w16se wp14">
+<w:document xmlns:wpc="http://schemas.microsoft.com/office/word/2010/wordprocessingCanvas" xmlns:cx="http://schemas.microsoft.com/office/drawing/2014/chartex" xmlns:cx1="http://schemas.microsoft.com/office/drawing/2015/9/8/chartex" xmlns:cx2="http://schemas.microsoft.com/office/drawing/2015/10/21/chartex" xmlns:cx3="http://schemas.microsoft.com/office/drawing/2016/5/9/chartex" xmlns:cx4="http://schemas.microsoft.com/office/drawing/2016/5/10/chartex" xmlns:cx5="http://schemas.microsoft.com/office/drawing/2016/5/11/chartex" xmlns:cx6="http://schemas.microsoft.com/office/drawing/2016/5/12/chartex" xmlns:cx7="http://schemas.microsoft.com/office/drawing/2016/5/13/chartex" xmlns:cx8="http://schemas.microsoft.com/office/drawing/2016/5/14/chartex" xmlns:mc="http://schemas.openxmlformats.org/markup-compatibility/2006" xmlns:aink="http://schemas.microsoft.com/office/drawing/2016/ink" xmlns:am3d="http://schemas.microsoft.com/office/drawing/2017/model3d" xmlns:o="urn:schemas-microsoft-com:office:office" xmlns:oel="http://schemas.microsoft.com/office/2019/extlst" xmlns:r="http://schemas.openxmlformats.org/officeDocument/2006/relationships" xmlns:m="http://schemas.openxmlformats.org/officeDocument/2006/math" xmlns:v="urn:schemas-microsoft-com:vml" xmlns:wp14="http://schemas.microsoft.com/office/word/2010/wordprocessingDrawing" xmlns:wp="http://schemas.openxmlformats.org/drawingml/2006/wordprocessingDrawing" xmlns:w10="urn:schemas-microsoft-com:office:word" xmlns:w="http://schemas.openxmlformats.org/wordprocessingml/2006/main" xmlns:w14="http://schemas.microsoft.com/office/word/2010/wordml" xmlns:w15="http://schemas.microsoft.com/office/word/2012/wordml" xmlns:w16cex="http://schemas.microsoft.com/office/word/2018/wordml/cex" xmlns:w16cid="http://schemas.microsoft.com/office/word/2016/wordml/cid" xmlns:w16="http://schemas.microsoft.com/office/word/2018/wordml" xmlns:w16sdtdh="http://schemas.microsoft.com/office/word/2020/wordml/sdtdatahash" xmlns:w16se="http://schemas.microsoft.com/office/word/2015/wordml/symex" xmlns:wpg="http://schemas.microsoft.com/office/word/2010/wordprocessingGroup" xmlns:wpi="http://schemas.microsoft.com/office/word/2010/wordprocessingInk" xmlns:wne="http://schemas.microsoft.com/office/word/2006/wordml" xmlns:wps="http://schemas.microsoft.com/office/word/2010/wordprocessingShape" mc:Ignorable="w14 w15 w16se w16cid w16 w16cex w16sdtdh wp14">
   <w:body>
     <w:tbl>
       <w:tblPr>
@@ -347,8 +347,6 @@
                 <w:lang w:val="en-US"/>
               </w:rPr>
             </w:pPr>
-            <w:bookmarkStart w:id="0" w:name="_GoBack"/>
-            <w:bookmarkEnd w:id="0"/>
           </w:p>
         </w:tc>
       </w:tr>
@@ -533,7 +531,16 @@
           <w:p>
             <w:pPr>
               <w:jc w:val="center"/>
-            </w:pPr>
+              <w:rPr>
+                <w:lang w:val="en-US"/>
+              </w:rPr>
+            </w:pPr>
+            <w:r>
+              <w:rPr>
+                <w:lang w:val="en-US"/>
+              </w:rPr>
+              <w:t>DONE</w:t>
+            </w:r>
           </w:p>
         </w:tc>
       </w:tr>
@@ -573,6 +580,57 @@
           <w:p>
             <w:pPr>
               <w:jc w:val="center"/>
+              <w:rPr>
+                <w:lang w:val="en-US"/>
+              </w:rPr>
+            </w:pPr>
+            <w:r>
+              <w:rPr>
+                <w:lang w:val="en-US"/>
+              </w:rPr>
+              <w:t>DONE</w:t>
+            </w:r>
+          </w:p>
+          <w:p>
+            <w:pPr>
+              <w:jc w:val="center"/>
+              <w:rPr>
+                <w:lang w:val="en-US"/>
+              </w:rPr>
+            </w:pPr>
+            <w:r>
+              <w:rPr>
+                <w:lang w:val="en-US"/>
+              </w:rPr>
+              <w:t xml:space="preserve">I Don’t Know, </w:t>
+            </w:r>
+            <w:proofErr w:type="gramStart"/>
+            <w:r>
+              <w:rPr>
+                <w:lang w:val="en-US"/>
+              </w:rPr>
+              <w:t>The</w:t>
+            </w:r>
+            <w:proofErr w:type="gramEnd"/>
+            <w:r>
+              <w:rPr>
+                <w:lang w:val="en-US"/>
+              </w:rPr>
+              <w:t xml:space="preserve"> system was like this before I worked on it</w:t>
+            </w:r>
+            <w:r>
+              <w:rPr>
+                <w:lang w:val="en-US"/>
+              </w:rPr>
+              <w:t xml:space="preserve"> and don’t worry I has added administrator user</w:t>
+            </w:r>
+          </w:p>
+          <w:p>
+            <w:pPr>
+              <w:jc w:val="center"/>
+              <w:rPr>
+                <w:lang w:val="en-US"/>
+              </w:rPr>
             </w:pPr>
           </w:p>
         </w:tc>
@@ -622,6 +680,12 @@
                 <w:lang w:val="en-US"/>
               </w:rPr>
             </w:pPr>
+            <w:r>
+              <w:rPr>
+                <w:lang w:val="en-US"/>
+              </w:rPr>
+              <w:t>DONE</w:t>
+            </w:r>
           </w:p>
         </w:tc>
       </w:tr>
@@ -708,6 +772,46 @@
                 <w:lang w:val="en-US"/>
               </w:rPr>
             </w:pPr>
+            <w:r>
+              <w:rPr>
+                <w:lang w:val="en-US"/>
+              </w:rPr>
+              <w:t>DONE</w:t>
+            </w:r>
+          </w:p>
+          <w:p>
+            <w:pPr>
+              <w:jc w:val="center"/>
+              <w:rPr>
+                <w:lang w:val="en-US"/>
+              </w:rPr>
+            </w:pPr>
+            <w:r>
+              <w:rPr>
+                <w:lang w:val="en-US"/>
+              </w:rPr>
+              <w:t xml:space="preserve">Problem come from hosting </w:t>
+            </w:r>
+            <w:proofErr w:type="gramStart"/>
+            <w:r>
+              <w:rPr>
+                <w:lang w:val="en-US"/>
+              </w:rPr>
+              <w:t>setting,</w:t>
+            </w:r>
+            <w:proofErr w:type="gramEnd"/>
+            <w:r>
+              <w:rPr>
+                <w:lang w:val="en-US"/>
+              </w:rPr>
+              <w:t xml:space="preserve"> I have done </w:t>
+            </w:r>
+            <w:r>
+              <w:rPr>
+                <w:lang w:val="en-US"/>
+              </w:rPr>
+              <w:t>fix it tell me if there not match again</w:t>
+            </w:r>
           </w:p>
         </w:tc>
       </w:tr>
@@ -752,7 +856,16 @@
           <w:p>
             <w:pPr>
               <w:jc w:val="center"/>
-            </w:pPr>
+              <w:rPr>
+                <w:lang w:val="en-US"/>
+              </w:rPr>
+            </w:pPr>
+            <w:r>
+              <w:rPr>
+                <w:lang w:val="en-US"/>
+              </w:rPr>
+              <w:t>DONE</w:t>
+            </w:r>
           </w:p>
         </w:tc>
       </w:tr>
@@ -801,45 +914,15 @@
               <w:jc w:val="center"/>
             </w:pPr>
             <w:r>
-              <w:t>I have prepar</w:t>
-            </w:r>
-            <w:r>
-              <w:t>ed your iframe you can</w:t>
-            </w:r>
-          </w:p>
-          <w:p>
-            <w:pPr>
-              <w:jc w:val="center"/>
-            </w:pPr>
-            <w:r>
-              <w:t xml:space="preserve">embed it </w:t>
-            </w:r>
-            <w:r>
-              <w:t>in the institut</w:t>
-            </w:r>
-            <w:r>
-              <w:t xml:space="preserve">ion, or if you want to embed it </w:t>
-            </w:r>
-            <w:r>
-              <w:t>yourself it's easy enough.</w:t>
-            </w:r>
-            <w:r>
-              <w:t xml:space="preserve"> </w:t>
-            </w:r>
-            <w:r>
-              <w:t>create a new page to check the certificate and enter</w:t>
-            </w:r>
-            <w:r>
-              <w:t xml:space="preserve"> </w:t>
-            </w:r>
-            <w:r>
-              <w:t xml:space="preserve">the iframe address </w:t>
-            </w:r>
-            <w:r>
-              <w:t>h</w:t>
-            </w:r>
-            <w:r>
-              <w:t>ttps://testing.nazarethnet.com/certificate/start_iframe/</w:t>
+              <w:t>I have prepared your iframe you can</w:t>
+            </w:r>
+          </w:p>
+          <w:p>
+            <w:pPr>
+              <w:jc w:val="center"/>
+            </w:pPr>
+            <w:r>
+              <w:t>embed it in the institution, or if you want to embed it yourself it's easy enough. create a new page to check the certificate and enter the iframe address https://testing.nazarethnet.com/certificate/start_iframe/</w:t>
             </w:r>
           </w:p>
         </w:tc>
@@ -1064,7 +1147,16 @@
           <w:p>
             <w:pPr>
               <w:jc w:val="center"/>
-            </w:pPr>
+              <w:rPr>
+                <w:lang w:val="en-US"/>
+              </w:rPr>
+            </w:pPr>
+            <w:r>
+              <w:rPr>
+                <w:lang w:val="en-US"/>
+              </w:rPr>
+              <w:t>DONE</w:t>
+            </w:r>
           </w:p>
         </w:tc>
       </w:tr>
@@ -1104,7 +1196,16 @@
           <w:p>
             <w:pPr>
               <w:jc w:val="center"/>
-            </w:pPr>
+              <w:rPr>
+                <w:lang w:val="en-US"/>
+              </w:rPr>
+            </w:pPr>
+            <w:r>
+              <w:rPr>
+                <w:lang w:val="en-US"/>
+              </w:rPr>
+              <w:t>DONE</w:t>
+            </w:r>
           </w:p>
         </w:tc>
       </w:tr>
@@ -1136,6 +1237,7 @@
           </w:p>
           <w:p>
             <w:r>
+              <w:lastRenderedPageBreak/>
               <w:t>Export student grades and attendance with date ranges should be added</w:t>
             </w:r>
           </w:p>
@@ -1151,6 +1253,7 @@
               <w:jc w:val="center"/>
             </w:pPr>
             <w:r>
+              <w:lastRenderedPageBreak/>
               <w:t>DONE</w:t>
             </w:r>
           </w:p>
@@ -1189,7 +1292,6 @@
           </w:p>
           <w:p>
             <w:r>
-              <w:lastRenderedPageBreak/>
               <w:t>With the duplicate feature, I can duplicate the same activities, assignments, forums, etc.</w:t>
             </w:r>
           </w:p>
@@ -1240,6 +1342,66 @@
             <w:shd w:val="clear" w:color="auto" w:fill="auto"/>
             <w:vAlign w:val="center"/>
           </w:tcPr>
+          <w:p>
+            <w:pPr>
+              <w:pStyle w:val="NormalWeb"/>
+              <w:rPr>
+                <w:rFonts w:ascii="Calibri" w:hAnsi="Calibri" w:cs="Calibri"/>
+                <w:color w:val="000000"/>
+                <w:sz w:val="22"/>
+                <w:szCs w:val="22"/>
+              </w:rPr>
+            </w:pPr>
+            <w:r>
+              <w:rPr>
+                <w:rFonts w:ascii="Calibri" w:hAnsi="Calibri" w:cs="Calibri"/>
+                <w:color w:val="000000"/>
+                <w:sz w:val="22"/>
+                <w:szCs w:val="22"/>
+              </w:rPr>
+              <w:t>we cannot directly transfer the grades into the new section's existing activities because each activity in the system has a unique ID. When we transfer a student, the grades are linked to the old activity IDs.</w:t>
+            </w:r>
+          </w:p>
+          <w:p>
+            <w:pPr>
+              <w:pStyle w:val="NormalWeb"/>
+              <w:rPr>
+                <w:rFonts w:ascii="Calibri" w:hAnsi="Calibri" w:cs="Calibri"/>
+                <w:color w:val="000000"/>
+                <w:sz w:val="22"/>
+                <w:szCs w:val="22"/>
+              </w:rPr>
+            </w:pPr>
+            <w:r>
+              <w:rPr>
+                <w:rFonts w:ascii="Calibri" w:hAnsi="Calibri" w:cs="Calibri"/>
+                <w:color w:val="000000"/>
+                <w:sz w:val="22"/>
+                <w:szCs w:val="22"/>
+              </w:rPr>
+              <w:t>If we try to match them with the new section’s existing activities, it can cause data conflicts or wrong results. To keep the data clean and safe, we avoid doing this.</w:t>
+            </w:r>
+          </w:p>
+          <w:p>
+            <w:pPr>
+              <w:pStyle w:val="NormalWeb"/>
+              <w:rPr>
+                <w:rFonts w:ascii="Calibri" w:hAnsi="Calibri" w:cs="Calibri"/>
+                <w:color w:val="000000"/>
+                <w:sz w:val="22"/>
+                <w:szCs w:val="22"/>
+              </w:rPr>
+            </w:pPr>
+            <w:r>
+              <w:rPr>
+                <w:rFonts w:ascii="Calibri" w:hAnsi="Calibri" w:cs="Calibri"/>
+                <w:color w:val="000000"/>
+                <w:sz w:val="22"/>
+                <w:szCs w:val="22"/>
+              </w:rPr>
+              <w:t>That’s why the system needs to copy the same activities when transferring a student — so the grades match perfectly without any risk.</w:t>
+            </w:r>
+          </w:p>
           <w:p>
             <w:pPr>
               <w:jc w:val="center"/>
@@ -1263,7 +1425,7 @@
 </file>
 
 <file path=word/styles.xml><?xml version="1.0" encoding="utf-8"?>
-<w:styles xmlns:mc="http://schemas.openxmlformats.org/markup-compatibility/2006" xmlns:r="http://schemas.openxmlformats.org/officeDocument/2006/relationships" xmlns:w="http://schemas.openxmlformats.org/wordprocessingml/2006/main" xmlns:w14="http://schemas.microsoft.com/office/word/2010/wordml" xmlns:w15="http://schemas.microsoft.com/office/word/2012/wordml" xmlns:w16se="http://schemas.microsoft.com/office/word/2015/wordml/symex" mc:Ignorable="w14 w15 w16se">
+<w:styles xmlns:mc="http://schemas.openxmlformats.org/markup-compatibility/2006" xmlns:r="http://schemas.openxmlformats.org/officeDocument/2006/relationships" xmlns:w="http://schemas.openxmlformats.org/wordprocessingml/2006/main" xmlns:w14="http://schemas.microsoft.com/office/word/2010/wordml" xmlns:w15="http://schemas.microsoft.com/office/word/2012/wordml" xmlns:w16cex="http://schemas.microsoft.com/office/word/2018/wordml/cex" xmlns:w16cid="http://schemas.microsoft.com/office/word/2016/wordml/cid" xmlns:w16="http://schemas.microsoft.com/office/word/2018/wordml" xmlns:w16sdtdh="http://schemas.microsoft.com/office/word/2020/wordml/sdtdatahash" xmlns:w16se="http://schemas.microsoft.com/office/word/2015/wordml/symex" mc:Ignorable="w14 w15 w16se w16cid w16 w16cex w16sdtdh">
   <w:docDefaults>
     <w:rPrDefault>
       <w:rPr>
@@ -1279,7 +1441,7 @@
       </w:pPr>
     </w:pPrDefault>
   </w:docDefaults>
-  <w:latentStyles w:defLockedState="0" w:defUIPriority="99" w:defSemiHidden="0" w:defUnhideWhenUsed="0" w:defQFormat="0" w:count="371">
+  <w:latentStyles w:defLockedState="0" w:defUIPriority="99" w:defSemiHidden="0" w:defUnhideWhenUsed="0" w:defQFormat="0" w:count="376">
     <w:lsdException w:name="Normal" w:uiPriority="0" w:qFormat="1"/>
     <w:lsdException w:name="heading 1" w:uiPriority="9" w:qFormat="1"/>
     <w:lsdException w:name="heading 2" w:semiHidden="1" w:uiPriority="9" w:unhideWhenUsed="1" w:qFormat="1"/>
@@ -1385,7 +1547,6 @@
     <w:lsdException w:name="HTML Sample" w:semiHidden="1" w:unhideWhenUsed="1"/>
     <w:lsdException w:name="HTML Typewriter" w:semiHidden="1" w:unhideWhenUsed="1"/>
     <w:lsdException w:name="HTML Variable" w:semiHidden="1" w:unhideWhenUsed="1"/>
-    <w:lsdException w:name="Normal Table" w:semiHidden="1" w:unhideWhenUsed="1"/>
     <w:lsdException w:name="annotation subject" w:semiHidden="1" w:unhideWhenUsed="1"/>
     <w:lsdException w:name="No List" w:semiHidden="1" w:unhideWhenUsed="1"/>
     <w:lsdException w:name="Outline List 1" w:semiHidden="1" w:unhideWhenUsed="1"/>
@@ -1428,11 +1589,8 @@
     <w:lsdException w:name="Table Contemporary" w:semiHidden="1" w:unhideWhenUsed="1"/>
     <w:lsdException w:name="Table Elegant" w:semiHidden="1" w:unhideWhenUsed="1"/>
     <w:lsdException w:name="Table Professional" w:semiHidden="1" w:unhideWhenUsed="1"/>
-    <w:lsdException w:name="Table Subtle 1" w:semiHidden="1" w:unhideWhenUsed="1"/>
     <w:lsdException w:name="Table Subtle 2" w:semiHidden="1" w:unhideWhenUsed="1"/>
     <w:lsdException w:name="Table Web 1" w:semiHidden="1" w:unhideWhenUsed="1"/>
-    <w:lsdException w:name="Table Web 2" w:semiHidden="1" w:unhideWhenUsed="1"/>
-    <w:lsdException w:name="Table Web 3" w:semiHidden="1" w:unhideWhenUsed="1"/>
     <w:lsdException w:name="Balloon Text" w:semiHidden="1" w:unhideWhenUsed="1"/>
     <w:lsdException w:name="Table Grid" w:uiPriority="39"/>
     <w:lsdException w:name="Table Theme" w:semiHidden="1" w:unhideWhenUsed="1"/>
@@ -1651,6 +1809,11 @@
     <w:lsdException w:name="List Table 5 Dark Accent 6" w:uiPriority="50"/>
     <w:lsdException w:name="List Table 6 Colorful Accent 6" w:uiPriority="51"/>
     <w:lsdException w:name="List Table 7 Colorful Accent 6" w:uiPriority="52"/>
+    <w:lsdException w:name="Mention" w:semiHidden="1" w:unhideWhenUsed="1"/>
+    <w:lsdException w:name="Smart Hyperlink" w:semiHidden="1" w:unhideWhenUsed="1"/>
+    <w:lsdException w:name="Hashtag" w:semiHidden="1" w:unhideWhenUsed="1"/>
+    <w:lsdException w:name="Unresolved Mention" w:semiHidden="1" w:unhideWhenUsed="1"/>
+    <w:lsdException w:name="Smart Link" w:semiHidden="1" w:unhideWhenUsed="1"/>
   </w:latentStyles>
   <w:style w:type="paragraph" w:default="1" w:styleId="Normal">
     <w:name w:val="Normal"/>
@@ -1723,6 +1886,23 @@
       <w:ind w:left="720"/>
       <w:contextualSpacing/>
     </w:pPr>
+  </w:style>
+  <w:style w:type="paragraph" w:styleId="NormalWeb">
+    <w:name w:val="Normal (Web)"/>
+    <w:basedOn w:val="Normal"/>
+    <w:uiPriority w:val="99"/>
+    <w:semiHidden/>
+    <w:unhideWhenUsed/>
+    <w:rsid w:val="00654A80"/>
+    <w:pPr>
+      <w:spacing w:before="100" w:beforeAutospacing="1" w:after="100" w:afterAutospacing="1" w:line="240" w:lineRule="auto"/>
+    </w:pPr>
+    <w:rPr>
+      <w:rFonts w:ascii="Times New Roman" w:eastAsia="Times New Roman" w:hAnsi="Times New Roman" w:cs="Times New Roman"/>
+      <w:sz w:val="24"/>
+      <w:szCs w:val="24"/>
+      <w:lang w:val="en-ID"/>
+    </w:rPr>
   </w:style>
 </w:styles>
 </file>

</xml_diff>

<commit_message>
tinggal nu utama anu dina panel
</commit_message>
<xml_diff>
--- a/Todo 28042025/revision2/Checklist.docx
+++ b/Todo 28042025/revision2/Checklist.docx
@@ -295,10 +295,18 @@
           <w:p>
             <w:pPr>
               <w:jc w:val="center"/>
-              <w:rPr>
-                <w:lang w:val="en-US"/>
-              </w:rPr>
-            </w:pPr>
+            </w:pPr>
+            <w:r>
+              <w:t>DONE</w:t>
+            </w:r>
+          </w:p>
+          <w:p>
+            <w:pPr>
+              <w:jc w:val="center"/>
+            </w:pPr>
+            <w:r>
+              <w:t>But i just found 1 error when we adding add lesson</w:t>
+            </w:r>
           </w:p>
         </w:tc>
       </w:tr>
@@ -346,41 +354,624 @@
             </w:pPr>
             <w:r>
               <w:t>DONE</w:t>
+            </w:r>
+          </w:p>
+        </w:tc>
+      </w:tr>
+      <w:tr>
+        <w:tc>
+          <w:tcPr>
+            <w:tcW w:w="562" w:type="dxa"/>
+            <w:vAlign w:val="center"/>
+          </w:tcPr>
+          <w:p>
+            <w:pPr>
+              <w:jc w:val="center"/>
+            </w:pPr>
+            <w:r>
+              <w:t>7</w:t>
+            </w:r>
+          </w:p>
+        </w:tc>
+        <w:tc>
+          <w:tcPr>
+            <w:tcW w:w="5670" w:type="dxa"/>
+            <w:shd w:val="clear" w:color="auto" w:fill="auto"/>
+            <w:vAlign w:val="center"/>
+          </w:tcPr>
+          <w:p>
+            <w:r>
+              <w:t>Add filter</w:t>
+            </w:r>
+          </w:p>
+          <w:p>
+            <w:r>
+              <w:t>http://testing.nazarethnet.com/admin/online_courses/</w:t>
+            </w:r>
+          </w:p>
+        </w:tc>
+        <w:tc>
+          <w:tcPr>
+            <w:tcW w:w="4403" w:type="dxa"/>
+            <w:shd w:val="clear" w:color="auto" w:fill="auto"/>
+            <w:vAlign w:val="center"/>
+          </w:tcPr>
+          <w:p>
+            <w:pPr>
+              <w:jc w:val="center"/>
+            </w:pPr>
+            <w:r>
+              <w:t>DONE</w:t>
+            </w:r>
+          </w:p>
+        </w:tc>
+      </w:tr>
+      <w:tr>
+        <w:tc>
+          <w:tcPr>
+            <w:tcW w:w="562" w:type="dxa"/>
+            <w:vAlign w:val="center"/>
+          </w:tcPr>
+          <w:p>
+            <w:pPr>
+              <w:jc w:val="center"/>
+            </w:pPr>
+            <w:r>
+              <w:t>8</w:t>
+            </w:r>
+          </w:p>
+        </w:tc>
+        <w:tc>
+          <w:tcPr>
+            <w:tcW w:w="5670" w:type="dxa"/>
+            <w:shd w:val="clear" w:color="auto" w:fill="auto"/>
+            <w:vAlign w:val="center"/>
+          </w:tcPr>
+          <w:p>
+            <w:r>
+              <w:t>Add a branch so that it is only sent to the assigned students of that branch and not in</w:t>
+            </w:r>
+          </w:p>
+          <w:p>
+            <w:r>
+              <w:t>General http://testing.nazarethnet.com/admin/polls/</w:t>
+            </w:r>
+          </w:p>
+        </w:tc>
+        <w:tc>
+          <w:tcPr>
+            <w:tcW w:w="4403" w:type="dxa"/>
+            <w:shd w:val="clear" w:color="auto" w:fill="auto"/>
+            <w:vAlign w:val="center"/>
+          </w:tcPr>
+          <w:p>
+            <w:pPr>
+              <w:jc w:val="center"/>
+              <w:rPr>
+                <w:lang w:val="en-US"/>
+              </w:rPr>
+            </w:pPr>
+            <w:r>
+              <w:rPr>
+                <w:lang w:val="en-US"/>
+              </w:rPr>
+              <w:t>DONE</w:t>
+            </w:r>
+          </w:p>
+        </w:tc>
+      </w:tr>
+      <w:tr>
+        <w:tc>
+          <w:tcPr>
+            <w:tcW w:w="562" w:type="dxa"/>
+            <w:vAlign w:val="center"/>
+          </w:tcPr>
+          <w:p>
+            <w:pPr>
+              <w:jc w:val="center"/>
+            </w:pPr>
+            <w:r>
+              <w:t>9</w:t>
+            </w:r>
+          </w:p>
+        </w:tc>
+        <w:tc>
+          <w:tcPr>
+            <w:tcW w:w="5670" w:type="dxa"/>
+            <w:shd w:val="clear" w:color="auto" w:fill="auto"/>
+            <w:vAlign w:val="center"/>
+          </w:tcPr>
+          <w:p>
+            <w:r>
+              <w:t>This page doesn't work</w:t>
+            </w:r>
+            <w:r>
+              <w:t xml:space="preserve"> (Realted to Number 22) https://testing.nazarethnet.com/admin/create_report/send</w:t>
+            </w:r>
+          </w:p>
+        </w:tc>
+        <w:tc>
+          <w:tcPr>
+            <w:tcW w:w="4403" w:type="dxa"/>
+            <w:shd w:val="clear" w:color="auto" w:fill="auto"/>
+            <w:vAlign w:val="center"/>
+          </w:tcPr>
+          <w:p>
+            <w:pPr>
+              <w:jc w:val="center"/>
+            </w:pPr>
+            <w:r>
+              <w:t>DONE</w:t>
+            </w:r>
+          </w:p>
+        </w:tc>
+      </w:tr>
+      <w:tr>
+        <w:tc>
+          <w:tcPr>
+            <w:tcW w:w="562" w:type="dxa"/>
+            <w:vAlign w:val="center"/>
+          </w:tcPr>
+          <w:p>
+            <w:pPr>
+              <w:jc w:val="center"/>
+            </w:pPr>
+            <w:r>
+              <w:t>10</w:t>
+            </w:r>
+          </w:p>
+        </w:tc>
+        <w:tc>
+          <w:tcPr>
+            <w:tcW w:w="5670" w:type="dxa"/>
+            <w:shd w:val="clear" w:color="auto" w:fill="auto"/>
+            <w:vAlign w:val="center"/>
+          </w:tcPr>
+          <w:p>
+            <w:r>
+              <w:t>You can also add a filter and make the background white.</w:t>
+            </w:r>
+          </w:p>
+        </w:tc>
+        <w:tc>
+          <w:tcPr>
+            <w:tcW w:w="4403" w:type="dxa"/>
+            <w:shd w:val="clear" w:color="auto" w:fill="auto"/>
+            <w:vAlign w:val="center"/>
+          </w:tcPr>
+          <w:p>
+            <w:pPr>
+              <w:jc w:val="center"/>
+              <w:rPr>
+                <w:lang w:val="en-US"/>
+              </w:rPr>
+            </w:pPr>
+            <w:r>
+              <w:rPr>
+                <w:lang w:val="en-US"/>
+              </w:rPr>
+              <w:t>DONE</w:t>
+            </w:r>
+          </w:p>
+        </w:tc>
+      </w:tr>
+      <w:tr>
+        <w:tc>
+          <w:tcPr>
+            <w:tcW w:w="562" w:type="dxa"/>
+            <w:vAlign w:val="center"/>
+          </w:tcPr>
+          <w:p>
+            <w:pPr>
+              <w:jc w:val="center"/>
+            </w:pPr>
+            <w:r>
+              <w:t>11</w:t>
+            </w:r>
+          </w:p>
+        </w:tc>
+        <w:tc>
+          <w:tcPr>
+            <w:tcW w:w="5670" w:type="dxa"/>
+            <w:shd w:val="clear" w:color="auto" w:fill="auto"/>
+            <w:vAlign w:val="center"/>
+          </w:tcPr>
+          <w:p>
+            <w:r>
+              <w:t>WHY DOESN'T THE ADMINISTRATOR USER HAVE ONLINE COURSES?</w:t>
+            </w:r>
+          </w:p>
+        </w:tc>
+        <w:tc>
+          <w:tcPr>
+            <w:tcW w:w="4403" w:type="dxa"/>
+            <w:shd w:val="clear" w:color="auto" w:fill="auto"/>
+            <w:vAlign w:val="center"/>
+          </w:tcPr>
+          <w:p>
+            <w:pPr>
+              <w:jc w:val="center"/>
+              <w:rPr>
+                <w:lang w:val="en-US"/>
+              </w:rPr>
+            </w:pPr>
+            <w:r>
+              <w:rPr>
+                <w:lang w:val="en-US"/>
+              </w:rPr>
+              <w:t>DONE</w:t>
+            </w:r>
+          </w:p>
+          <w:p>
+            <w:pPr>
+              <w:jc w:val="center"/>
+              <w:rPr>
+                <w:lang w:val="en-US"/>
+              </w:rPr>
+            </w:pPr>
+            <w:r>
+              <w:rPr>
+                <w:lang w:val="en-US"/>
+              </w:rPr>
+              <w:t xml:space="preserve">I Don’t Know, </w:t>
+            </w:r>
+            <w:r>
+              <w:rPr>
+                <w:lang w:val="en-US"/>
+              </w:rPr>
+              <w:t>The system was like this before I worked on it</w:t>
+            </w:r>
+            <w:r>
+              <w:rPr>
+                <w:lang w:val="en-US"/>
+              </w:rPr>
+              <w:t xml:space="preserve"> and don’t worry I has added administrator user</w:t>
+            </w:r>
+          </w:p>
+          <w:p>
+            <w:pPr>
+              <w:jc w:val="center"/>
+              <w:rPr>
+                <w:lang w:val="en-US"/>
+              </w:rPr>
+            </w:pPr>
+          </w:p>
+        </w:tc>
+      </w:tr>
+      <w:tr>
+        <w:tc>
+          <w:tcPr>
+            <w:tcW w:w="562" w:type="dxa"/>
+            <w:vAlign w:val="center"/>
+          </w:tcPr>
+          <w:p>
+            <w:pPr>
+              <w:jc w:val="center"/>
+            </w:pPr>
+            <w:r>
+              <w:t>12</w:t>
+            </w:r>
+          </w:p>
+        </w:tc>
+        <w:tc>
+          <w:tcPr>
+            <w:tcW w:w="5670" w:type="dxa"/>
+            <w:shd w:val="clear" w:color="auto" w:fill="auto"/>
+            <w:vAlign w:val="center"/>
+          </w:tcPr>
+          <w:p>
+            <w:r>
+              <w:t>In the books section, you must have the branch selection to be able to control which</w:t>
+            </w:r>
+          </w:p>
+          <w:p>
+            <w:r>
+              <w:t>students it is addressed to.</w:t>
+            </w:r>
+          </w:p>
+        </w:tc>
+        <w:tc>
+          <w:tcPr>
+            <w:tcW w:w="4403" w:type="dxa"/>
+            <w:shd w:val="clear" w:color="auto" w:fill="auto"/>
+            <w:vAlign w:val="center"/>
+          </w:tcPr>
+          <w:p>
+            <w:pPr>
+              <w:jc w:val="center"/>
+              <w:rPr>
+                <w:lang w:val="en-US"/>
+              </w:rPr>
+            </w:pPr>
+            <w:r>
+              <w:rPr>
+                <w:lang w:val="en-US"/>
+              </w:rPr>
+              <w:t>DONE</w:t>
+            </w:r>
+          </w:p>
+        </w:tc>
+      </w:tr>
+      <w:tr>
+        <w:tc>
+          <w:tcPr>
+            <w:tcW w:w="562" w:type="dxa"/>
+            <w:vAlign w:val="center"/>
+          </w:tcPr>
+          <w:p>
+            <w:pPr>
+              <w:jc w:val="center"/>
+            </w:pPr>
+            <w:r>
+              <w:t>13</w:t>
+            </w:r>
+          </w:p>
+        </w:tc>
+        <w:tc>
+          <w:tcPr>
+            <w:tcW w:w="5670" w:type="dxa"/>
+            <w:shd w:val="clear" w:color="auto" w:fill="auto"/>
+            <w:vAlign w:val="center"/>
+          </w:tcPr>
+          <w:p>
+            <w:r>
+              <w:t>This page doesn't work</w:t>
+            </w:r>
+            <w:r>
+              <w:t xml:space="preserve"> (Realted to Number 20)</w:t>
+            </w:r>
+          </w:p>
+          <w:p>
+            <w:r>
+              <w:t>https://testing.nazarethnet.co</w:t>
+            </w:r>
+            <w:r>
+              <w:t>m/student/submit_online_exam/14</w:t>
+            </w:r>
+          </w:p>
+        </w:tc>
+        <w:tc>
+          <w:tcPr>
+            <w:tcW w:w="4403" w:type="dxa"/>
+            <w:shd w:val="clear" w:color="auto" w:fill="auto"/>
+            <w:vAlign w:val="center"/>
+          </w:tcPr>
+          <w:p>
+            <w:pPr>
+              <w:jc w:val="center"/>
+            </w:pPr>
+            <w:r>
+              <w:t>DONE</w:t>
+            </w:r>
+          </w:p>
+        </w:tc>
+      </w:tr>
+      <w:tr>
+        <w:tc>
+          <w:tcPr>
+            <w:tcW w:w="562" w:type="dxa"/>
+            <w:vAlign w:val="center"/>
+          </w:tcPr>
+          <w:p>
+            <w:pPr>
+              <w:jc w:val="center"/>
+            </w:pPr>
+            <w:r>
+              <w:t>14</w:t>
+            </w:r>
+          </w:p>
+        </w:tc>
+        <w:tc>
+          <w:tcPr>
+            <w:tcW w:w="5670" w:type="dxa"/>
+            <w:shd w:val="clear" w:color="auto" w:fill="auto"/>
+            <w:vAlign w:val="center"/>
+          </w:tcPr>
+          <w:p>
+            <w:r>
+              <w:t>The rating placement time does not match</w:t>
+            </w:r>
+          </w:p>
+        </w:tc>
+        <w:tc>
+          <w:tcPr>
+            <w:tcW w:w="4403" w:type="dxa"/>
+            <w:shd w:val="clear" w:color="auto" w:fill="auto"/>
+            <w:vAlign w:val="center"/>
+          </w:tcPr>
+          <w:p>
+            <w:pPr>
+              <w:jc w:val="center"/>
+              <w:rPr>
+                <w:lang w:val="en-US"/>
+              </w:rPr>
+            </w:pPr>
+            <w:r>
+              <w:rPr>
+                <w:lang w:val="en-US"/>
+              </w:rPr>
+              <w:t>DONE</w:t>
+            </w:r>
+          </w:p>
+          <w:p>
+            <w:pPr>
+              <w:jc w:val="center"/>
+              <w:rPr>
+                <w:lang w:val="en-US"/>
+              </w:rPr>
+            </w:pPr>
+            <w:r>
+              <w:rPr>
+                <w:lang w:val="en-US"/>
+              </w:rPr>
+              <w:t xml:space="preserve">Problem come from hosting setting, I have done </w:t>
+            </w:r>
+            <w:r>
+              <w:rPr>
+                <w:lang w:val="en-US"/>
+              </w:rPr>
+              <w:t>fix it tell me if there not match again</w:t>
+            </w:r>
+          </w:p>
+        </w:tc>
+      </w:tr>
+      <w:tr>
+        <w:tc>
+          <w:tcPr>
+            <w:tcW w:w="562" w:type="dxa"/>
+            <w:vAlign w:val="center"/>
+          </w:tcPr>
+          <w:p>
+            <w:pPr>
+              <w:jc w:val="center"/>
+            </w:pPr>
+            <w:r>
+              <w:t>15</w:t>
+            </w:r>
+          </w:p>
+        </w:tc>
+        <w:tc>
+          <w:tcPr>
+            <w:tcW w:w="5670" w:type="dxa"/>
+            <w:shd w:val="clear" w:color="auto" w:fill="auto"/>
+            <w:vAlign w:val="center"/>
+          </w:tcPr>
+          <w:p>
+            <w:r>
+              <w:t>Once the student has obtained the certificate with QR, it should not be modified with</w:t>
+            </w:r>
+          </w:p>
+          <w:p>
+            <w:r>
+              <w:t>the new certificate design.</w:t>
+            </w:r>
+          </w:p>
+        </w:tc>
+        <w:tc>
+          <w:tcPr>
+            <w:tcW w:w="4403" w:type="dxa"/>
+            <w:shd w:val="clear" w:color="auto" w:fill="auto"/>
+            <w:vAlign w:val="center"/>
+          </w:tcPr>
+          <w:p>
+            <w:pPr>
+              <w:jc w:val="center"/>
+              <w:rPr>
+                <w:lang w:val="en-US"/>
+              </w:rPr>
+            </w:pPr>
+            <w:r>
+              <w:rPr>
+                <w:lang w:val="en-US"/>
+              </w:rPr>
+              <w:t>DONE</w:t>
+            </w:r>
+          </w:p>
+        </w:tc>
+      </w:tr>
+      <w:tr>
+        <w:tc>
+          <w:tcPr>
+            <w:tcW w:w="562" w:type="dxa"/>
+            <w:vAlign w:val="center"/>
+          </w:tcPr>
+          <w:p>
+            <w:pPr>
+              <w:jc w:val="center"/>
+            </w:pPr>
+            <w:r>
+              <w:t>16</w:t>
+            </w:r>
+          </w:p>
+        </w:tc>
+        <w:tc>
+          <w:tcPr>
+            <w:tcW w:w="5670" w:type="dxa"/>
+            <w:shd w:val="clear" w:color="auto" w:fill="auto"/>
+            <w:vAlign w:val="center"/>
+          </w:tcPr>
+          <w:p>
+            <w:r>
+              <w:t>How can I get only the validation page so I can place it on the institution's page?</w:t>
+            </w:r>
+          </w:p>
+        </w:tc>
+        <w:tc>
+          <w:tcPr>
+            <w:tcW w:w="4403" w:type="dxa"/>
+            <w:shd w:val="clear" w:color="auto" w:fill="auto"/>
+          </w:tcPr>
+          <w:p>
+            <w:pPr>
+              <w:jc w:val="center"/>
+            </w:pPr>
+            <w:r>
+              <w:t>DONE</w:t>
+            </w:r>
+          </w:p>
+          <w:p>
+            <w:pPr>
+              <w:jc w:val="center"/>
+            </w:pPr>
+            <w:r>
+              <w:t>I have prepared your iframe you can</w:t>
+            </w:r>
+          </w:p>
+          <w:p>
+            <w:pPr>
+              <w:jc w:val="center"/>
+            </w:pPr>
+            <w:r>
+              <w:t>embed it in the institution, or if you want to embed it yourself it's easy enough. create a new page to check the certific</w:t>
             </w:r>
             <w:bookmarkStart w:id="0" w:name="_GoBack"/>
             <w:bookmarkEnd w:id="0"/>
-          </w:p>
-        </w:tc>
-      </w:tr>
-      <w:tr>
-        <w:tc>
-          <w:tcPr>
-            <w:tcW w:w="562" w:type="dxa"/>
-            <w:vAlign w:val="center"/>
-          </w:tcPr>
-          <w:p>
-            <w:pPr>
-              <w:jc w:val="center"/>
-            </w:pPr>
-            <w:r>
-              <w:t>7</w:t>
-            </w:r>
-          </w:p>
-        </w:tc>
-        <w:tc>
-          <w:tcPr>
-            <w:tcW w:w="5670" w:type="dxa"/>
-            <w:shd w:val="clear" w:color="auto" w:fill="auto"/>
-            <w:vAlign w:val="center"/>
-          </w:tcPr>
-          <w:p>
-            <w:r>
-              <w:t>Add filter</w:t>
-            </w:r>
-          </w:p>
-          <w:p>
-            <w:r>
-              <w:t>http://testing.nazarethnet.com/admin/online_courses/</w:t>
+            <w:r>
+              <w:t xml:space="preserve">ate and enter the iframe address </w:t>
+            </w:r>
+            <w:hyperlink r:id="rId5" w:history="1">
+              <w:r>
+                <w:rPr>
+                  <w:rStyle w:val="Hyperlink"/>
+                </w:rPr>
+                <w:t>https://testing.nazarethnet.com/certificate/start_iframe/</w:t>
+              </w:r>
+            </w:hyperlink>
+          </w:p>
+          <w:p>
+            <w:pPr>
+              <w:jc w:val="center"/>
+            </w:pPr>
+            <w:r>
+              <w:t>if you can’t do it just let me know i will help</w:t>
+            </w:r>
+          </w:p>
+        </w:tc>
+      </w:tr>
+      <w:tr>
+        <w:tc>
+          <w:tcPr>
+            <w:tcW w:w="562" w:type="dxa"/>
+            <w:vAlign w:val="center"/>
+          </w:tcPr>
+          <w:p>
+            <w:pPr>
+              <w:jc w:val="center"/>
+            </w:pPr>
+            <w:r>
+              <w:t>17</w:t>
+            </w:r>
+          </w:p>
+        </w:tc>
+        <w:tc>
+          <w:tcPr>
+            <w:tcW w:w="5670" w:type="dxa"/>
+            <w:shd w:val="clear" w:color="auto" w:fill="auto"/>
+            <w:vAlign w:val="center"/>
+          </w:tcPr>
+          <w:p>
+            <w:r>
+              <w:t>Duplication must be allowed to be carried out between branches and between sections</w:t>
             </w:r>
           </w:p>
         </w:tc>
@@ -411,44 +1002,81 @@
               <w:jc w:val="center"/>
             </w:pPr>
             <w:r>
-              <w:t>8</w:t>
-            </w:r>
-          </w:p>
-        </w:tc>
-        <w:tc>
-          <w:tcPr>
-            <w:tcW w:w="5670" w:type="dxa"/>
-            <w:shd w:val="clear" w:color="auto" w:fill="auto"/>
-            <w:vAlign w:val="center"/>
-          </w:tcPr>
-          <w:p>
-            <w:r>
-              <w:t>Add a branch so that it is only sent to the assigned students of that branch and not in</w:t>
-            </w:r>
-          </w:p>
-          <w:p>
-            <w:r>
-              <w:t>General http://testing.nazarethnet.com/admin/polls/</w:t>
-            </w:r>
-          </w:p>
-        </w:tc>
-        <w:tc>
-          <w:tcPr>
-            <w:tcW w:w="4403" w:type="dxa"/>
-            <w:shd w:val="clear" w:color="auto" w:fill="auto"/>
-            <w:vAlign w:val="center"/>
-          </w:tcPr>
-          <w:p>
-            <w:pPr>
-              <w:jc w:val="center"/>
-              <w:rPr>
-                <w:lang w:val="en-US"/>
-              </w:rPr>
-            </w:pPr>
-            <w:r>
-              <w:rPr>
-                <w:lang w:val="en-US"/>
-              </w:rPr>
+              <w:t>18</w:t>
+            </w:r>
+          </w:p>
+        </w:tc>
+        <w:tc>
+          <w:tcPr>
+            <w:tcW w:w="5670" w:type="dxa"/>
+            <w:shd w:val="clear" w:color="auto" w:fill="auto"/>
+            <w:vAlign w:val="center"/>
+          </w:tcPr>
+          <w:p>
+            <w:r>
+              <w:t>Add the fonts, emoticons and reactions feature here as well</w:t>
+            </w:r>
+          </w:p>
+          <w:p>
+            <w:r>
+              <w:t>http://testing.nazarethnet.com/admin/panel/</w:t>
+            </w:r>
+          </w:p>
+        </w:tc>
+        <w:tc>
+          <w:tcPr>
+            <w:tcW w:w="4403" w:type="dxa"/>
+            <w:shd w:val="clear" w:color="auto" w:fill="auto"/>
+            <w:vAlign w:val="center"/>
+          </w:tcPr>
+          <w:p>
+            <w:pPr>
+              <w:jc w:val="center"/>
+              <w:rPr>
+                <w:lang w:val="en-US"/>
+              </w:rPr>
+            </w:pPr>
+          </w:p>
+        </w:tc>
+      </w:tr>
+      <w:tr>
+        <w:tc>
+          <w:tcPr>
+            <w:tcW w:w="562" w:type="dxa"/>
+            <w:vAlign w:val="center"/>
+          </w:tcPr>
+          <w:p>
+            <w:pPr>
+              <w:jc w:val="center"/>
+            </w:pPr>
+            <w:r>
+              <w:t>19</w:t>
+            </w:r>
+          </w:p>
+        </w:tc>
+        <w:tc>
+          <w:tcPr>
+            <w:tcW w:w="5670" w:type="dxa"/>
+            <w:shd w:val="clear" w:color="auto" w:fill="auto"/>
+            <w:vAlign w:val="center"/>
+          </w:tcPr>
+          <w:p>
+            <w:r>
+              <w:t>THIS REACTION SHOULD BE A LITTLE BIGGER</w:t>
+            </w:r>
+          </w:p>
+        </w:tc>
+        <w:tc>
+          <w:tcPr>
+            <w:tcW w:w="4403" w:type="dxa"/>
+            <w:shd w:val="clear" w:color="auto" w:fill="auto"/>
+            <w:vAlign w:val="center"/>
+          </w:tcPr>
+          <w:p>
+            <w:pPr>
+              <w:jc w:val="center"/>
+            </w:pPr>
+            <w:r>
               <w:t>DONE</w:t>
             </w:r>
           </w:p>
@@ -465,199 +1093,128 @@
               <w:jc w:val="center"/>
             </w:pPr>
             <w:r>
-              <w:t>9</w:t>
-            </w:r>
-          </w:p>
-        </w:tc>
-        <w:tc>
-          <w:tcPr>
-            <w:tcW w:w="5670" w:type="dxa"/>
-            <w:shd w:val="clear" w:color="auto" w:fill="auto"/>
-            <w:vAlign w:val="center"/>
-          </w:tcPr>
-          <w:p>
-            <w:r>
-              <w:t>This page doesn't work</w:t>
-            </w:r>
-          </w:p>
-        </w:tc>
-        <w:tc>
-          <w:tcPr>
-            <w:tcW w:w="4403" w:type="dxa"/>
-            <w:shd w:val="clear" w:color="auto" w:fill="auto"/>
-            <w:vAlign w:val="center"/>
-          </w:tcPr>
-          <w:p>
-            <w:pPr>
-              <w:jc w:val="center"/>
-              <w:rPr>
-                <w:lang w:val="en-US"/>
-              </w:rPr>
-            </w:pPr>
-          </w:p>
-        </w:tc>
-      </w:tr>
-      <w:tr>
-        <w:tc>
-          <w:tcPr>
-            <w:tcW w:w="562" w:type="dxa"/>
-            <w:vAlign w:val="center"/>
-          </w:tcPr>
-          <w:p>
-            <w:pPr>
-              <w:jc w:val="center"/>
-            </w:pPr>
-            <w:r>
-              <w:t>10</w:t>
-            </w:r>
-          </w:p>
-        </w:tc>
-        <w:tc>
-          <w:tcPr>
-            <w:tcW w:w="5670" w:type="dxa"/>
-            <w:shd w:val="clear" w:color="auto" w:fill="auto"/>
-            <w:vAlign w:val="center"/>
-          </w:tcPr>
-          <w:p>
-            <w:r>
-              <w:t>You can also add a filter and make the background white.</w:t>
-            </w:r>
-          </w:p>
-        </w:tc>
-        <w:tc>
-          <w:tcPr>
-            <w:tcW w:w="4403" w:type="dxa"/>
-            <w:shd w:val="clear" w:color="auto" w:fill="auto"/>
-            <w:vAlign w:val="center"/>
-          </w:tcPr>
-          <w:p>
-            <w:pPr>
-              <w:jc w:val="center"/>
-              <w:rPr>
-                <w:lang w:val="en-US"/>
-              </w:rPr>
-            </w:pPr>
-            <w:r>
-              <w:rPr>
-                <w:lang w:val="en-US"/>
-              </w:rPr>
+              <w:t>20</w:t>
+            </w:r>
+          </w:p>
+        </w:tc>
+        <w:tc>
+          <w:tcPr>
+            <w:tcW w:w="5670" w:type="dxa"/>
+            <w:shd w:val="clear" w:color="auto" w:fill="auto"/>
+            <w:vAlign w:val="center"/>
+          </w:tcPr>
+          <w:p>
+            <w:r>
+              <w:t>As a student user, you cannot answer exam questions. The following message appears</w:t>
+            </w:r>
+          </w:p>
+        </w:tc>
+        <w:tc>
+          <w:tcPr>
+            <w:tcW w:w="4403" w:type="dxa"/>
+            <w:shd w:val="clear" w:color="auto" w:fill="auto"/>
+            <w:vAlign w:val="center"/>
+          </w:tcPr>
+          <w:p>
+            <w:pPr>
+              <w:jc w:val="center"/>
+            </w:pPr>
+            <w:r>
               <w:t>DONE</w:t>
             </w:r>
           </w:p>
-        </w:tc>
-      </w:tr>
-      <w:tr>
-        <w:tc>
-          <w:tcPr>
-            <w:tcW w:w="562" w:type="dxa"/>
-            <w:vAlign w:val="center"/>
-          </w:tcPr>
-          <w:p>
-            <w:pPr>
-              <w:jc w:val="center"/>
-            </w:pPr>
-            <w:r>
-              <w:t>11</w:t>
-            </w:r>
-          </w:p>
-        </w:tc>
-        <w:tc>
-          <w:tcPr>
-            <w:tcW w:w="5670" w:type="dxa"/>
-            <w:shd w:val="clear" w:color="auto" w:fill="auto"/>
-            <w:vAlign w:val="center"/>
-          </w:tcPr>
-          <w:p>
-            <w:r>
-              <w:t>WHY DOESN'T THE ADMINISTRATOR USER HAVE ONLINE COURSES?</w:t>
-            </w:r>
-          </w:p>
-        </w:tc>
-        <w:tc>
-          <w:tcPr>
-            <w:tcW w:w="4403" w:type="dxa"/>
-            <w:shd w:val="clear" w:color="auto" w:fill="auto"/>
-            <w:vAlign w:val="center"/>
-          </w:tcPr>
-          <w:p>
-            <w:pPr>
-              <w:jc w:val="center"/>
-              <w:rPr>
-                <w:lang w:val="en-US"/>
-              </w:rPr>
-            </w:pPr>
-            <w:r>
-              <w:rPr>
-                <w:lang w:val="en-US"/>
-              </w:rPr>
+          <w:p>
+            <w:pPr>
+              <w:jc w:val="center"/>
+            </w:pPr>
+          </w:p>
+        </w:tc>
+      </w:tr>
+      <w:tr>
+        <w:tc>
+          <w:tcPr>
+            <w:tcW w:w="562" w:type="dxa"/>
+            <w:vAlign w:val="center"/>
+          </w:tcPr>
+          <w:p>
+            <w:pPr>
+              <w:jc w:val="center"/>
+            </w:pPr>
+            <w:r>
+              <w:t>21</w:t>
+            </w:r>
+          </w:p>
+        </w:tc>
+        <w:tc>
+          <w:tcPr>
+            <w:tcW w:w="5670" w:type="dxa"/>
+            <w:shd w:val="clear" w:color="auto" w:fill="auto"/>
+            <w:vAlign w:val="center"/>
+          </w:tcPr>
+          <w:p>
+            <w:r>
+              <w:t>With the student user, you can only see books from a single section. If the student has</w:t>
+            </w:r>
+          </w:p>
+          <w:p>
+            <w:r>
+              <w:t>more than two sections and courses active, they should see books from the sections they</w:t>
+            </w:r>
+          </w:p>
+          <w:p>
+            <w:r>
+              <w:lastRenderedPageBreak/>
+              <w:t>have active.</w:t>
+            </w:r>
+          </w:p>
+        </w:tc>
+        <w:tc>
+          <w:tcPr>
+            <w:tcW w:w="4403" w:type="dxa"/>
+            <w:shd w:val="clear" w:color="auto" w:fill="auto"/>
+            <w:vAlign w:val="center"/>
+          </w:tcPr>
+          <w:p>
+            <w:pPr>
+              <w:jc w:val="center"/>
+              <w:rPr>
+                <w:lang w:val="en-US"/>
+              </w:rPr>
+            </w:pPr>
+            <w:r>
+              <w:rPr>
+                <w:lang w:val="en-US"/>
+              </w:rPr>
+              <w:lastRenderedPageBreak/>
               <w:t>DONE</w:t>
             </w:r>
           </w:p>
-          <w:p>
-            <w:pPr>
-              <w:jc w:val="center"/>
-              <w:rPr>
-                <w:lang w:val="en-US"/>
-              </w:rPr>
-            </w:pPr>
-            <w:r>
-              <w:rPr>
-                <w:lang w:val="en-US"/>
-              </w:rPr>
-              <w:t xml:space="preserve">I Don’t Know, </w:t>
-            </w:r>
-            <w:r>
-              <w:rPr>
-                <w:lang w:val="en-US"/>
-              </w:rPr>
-              <w:t>The system was like this before I worked on it</w:t>
-            </w:r>
-            <w:r>
-              <w:rPr>
-                <w:lang w:val="en-US"/>
-              </w:rPr>
-              <w:t xml:space="preserve"> and don’t worry I has added administrator user</w:t>
-            </w:r>
-          </w:p>
-          <w:p>
-            <w:pPr>
-              <w:jc w:val="center"/>
-              <w:rPr>
-                <w:lang w:val="en-US"/>
-              </w:rPr>
-            </w:pPr>
-          </w:p>
-        </w:tc>
-      </w:tr>
-      <w:tr>
-        <w:tc>
-          <w:tcPr>
-            <w:tcW w:w="562" w:type="dxa"/>
-            <w:vAlign w:val="center"/>
-          </w:tcPr>
-          <w:p>
-            <w:pPr>
-              <w:jc w:val="center"/>
-            </w:pPr>
-            <w:r>
-              <w:t>12</w:t>
-            </w:r>
-          </w:p>
-        </w:tc>
-        <w:tc>
-          <w:tcPr>
-            <w:tcW w:w="5670" w:type="dxa"/>
-            <w:shd w:val="clear" w:color="auto" w:fill="auto"/>
-            <w:vAlign w:val="center"/>
-          </w:tcPr>
-          <w:p>
-            <w:r>
-              <w:t>In the books section, you must have the branch selection to be able to control which</w:t>
-            </w:r>
-          </w:p>
-          <w:p>
-            <w:r>
-              <w:t>students it is addressed to.</w:t>
+        </w:tc>
+      </w:tr>
+      <w:tr>
+        <w:tc>
+          <w:tcPr>
+            <w:tcW w:w="562" w:type="dxa"/>
+            <w:vAlign w:val="center"/>
+          </w:tcPr>
+          <w:p>
+            <w:pPr>
+              <w:jc w:val="center"/>
+            </w:pPr>
+            <w:r>
+              <w:t>22</w:t>
+            </w:r>
+          </w:p>
+        </w:tc>
+        <w:tc>
+          <w:tcPr>
+            <w:tcW w:w="5670" w:type="dxa"/>
+            <w:shd w:val="clear" w:color="auto" w:fill="auto"/>
+            <w:vAlign w:val="center"/>
+          </w:tcPr>
+          <w:p>
+            <w:r>
+              <w:t>ERROR MESSAGE APPEARS WHEN CREATING THE REPORT</w:t>
             </w:r>
           </w:p>
         </w:tc>
@@ -694,512 +1251,6 @@
               <w:jc w:val="center"/>
             </w:pPr>
             <w:r>
-              <w:t>13</w:t>
-            </w:r>
-          </w:p>
-        </w:tc>
-        <w:tc>
-          <w:tcPr>
-            <w:tcW w:w="5670" w:type="dxa"/>
-            <w:shd w:val="clear" w:color="auto" w:fill="auto"/>
-            <w:vAlign w:val="center"/>
-          </w:tcPr>
-          <w:p>
-            <w:r>
-              <w:t>This page doesn't work</w:t>
-            </w:r>
-          </w:p>
-        </w:tc>
-        <w:tc>
-          <w:tcPr>
-            <w:tcW w:w="4403" w:type="dxa"/>
-            <w:shd w:val="clear" w:color="auto" w:fill="auto"/>
-            <w:vAlign w:val="center"/>
-          </w:tcPr>
-          <w:p>
-            <w:pPr>
-              <w:jc w:val="center"/>
-              <w:rPr>
-                <w:lang w:val="en-US"/>
-              </w:rPr>
-            </w:pPr>
-          </w:p>
-        </w:tc>
-      </w:tr>
-      <w:tr>
-        <w:tc>
-          <w:tcPr>
-            <w:tcW w:w="562" w:type="dxa"/>
-            <w:vAlign w:val="center"/>
-          </w:tcPr>
-          <w:p>
-            <w:pPr>
-              <w:jc w:val="center"/>
-            </w:pPr>
-            <w:r>
-              <w:t>14</w:t>
-            </w:r>
-          </w:p>
-        </w:tc>
-        <w:tc>
-          <w:tcPr>
-            <w:tcW w:w="5670" w:type="dxa"/>
-            <w:shd w:val="clear" w:color="auto" w:fill="auto"/>
-            <w:vAlign w:val="center"/>
-          </w:tcPr>
-          <w:p>
-            <w:r>
-              <w:t>The rating placement time does not match</w:t>
-            </w:r>
-          </w:p>
-        </w:tc>
-        <w:tc>
-          <w:tcPr>
-            <w:tcW w:w="4403" w:type="dxa"/>
-            <w:shd w:val="clear" w:color="auto" w:fill="auto"/>
-            <w:vAlign w:val="center"/>
-          </w:tcPr>
-          <w:p>
-            <w:pPr>
-              <w:jc w:val="center"/>
-              <w:rPr>
-                <w:lang w:val="en-US"/>
-              </w:rPr>
-            </w:pPr>
-            <w:r>
-              <w:rPr>
-                <w:lang w:val="en-US"/>
-              </w:rPr>
-              <w:t>DONE</w:t>
-            </w:r>
-          </w:p>
-          <w:p>
-            <w:pPr>
-              <w:jc w:val="center"/>
-              <w:rPr>
-                <w:lang w:val="en-US"/>
-              </w:rPr>
-            </w:pPr>
-            <w:r>
-              <w:rPr>
-                <w:lang w:val="en-US"/>
-              </w:rPr>
-              <w:t xml:space="preserve">Problem come from hosting setting, I have done </w:t>
-            </w:r>
-            <w:r>
-              <w:rPr>
-                <w:lang w:val="en-US"/>
-              </w:rPr>
-              <w:t>fix it tell me if there not match again</w:t>
-            </w:r>
-          </w:p>
-        </w:tc>
-      </w:tr>
-      <w:tr>
-        <w:tc>
-          <w:tcPr>
-            <w:tcW w:w="562" w:type="dxa"/>
-            <w:vAlign w:val="center"/>
-          </w:tcPr>
-          <w:p>
-            <w:pPr>
-              <w:jc w:val="center"/>
-            </w:pPr>
-            <w:r>
-              <w:t>15</w:t>
-            </w:r>
-          </w:p>
-        </w:tc>
-        <w:tc>
-          <w:tcPr>
-            <w:tcW w:w="5670" w:type="dxa"/>
-            <w:shd w:val="clear" w:color="auto" w:fill="auto"/>
-            <w:vAlign w:val="center"/>
-          </w:tcPr>
-          <w:p>
-            <w:r>
-              <w:t>Once the student has obtained the certificate with QR, it should not be modified with</w:t>
-            </w:r>
-          </w:p>
-          <w:p>
-            <w:r>
-              <w:t>the new certificate design.</w:t>
-            </w:r>
-          </w:p>
-        </w:tc>
-        <w:tc>
-          <w:tcPr>
-            <w:tcW w:w="4403" w:type="dxa"/>
-            <w:shd w:val="clear" w:color="auto" w:fill="auto"/>
-            <w:vAlign w:val="center"/>
-          </w:tcPr>
-          <w:p>
-            <w:pPr>
-              <w:jc w:val="center"/>
-              <w:rPr>
-                <w:lang w:val="en-US"/>
-              </w:rPr>
-            </w:pPr>
-            <w:r>
-              <w:rPr>
-                <w:lang w:val="en-US"/>
-              </w:rPr>
-              <w:t>DONE</w:t>
-            </w:r>
-          </w:p>
-        </w:tc>
-      </w:tr>
-      <w:tr>
-        <w:tc>
-          <w:tcPr>
-            <w:tcW w:w="562" w:type="dxa"/>
-            <w:vAlign w:val="center"/>
-          </w:tcPr>
-          <w:p>
-            <w:pPr>
-              <w:jc w:val="center"/>
-            </w:pPr>
-            <w:r>
-              <w:t>16</w:t>
-            </w:r>
-          </w:p>
-        </w:tc>
-        <w:tc>
-          <w:tcPr>
-            <w:tcW w:w="5670" w:type="dxa"/>
-            <w:shd w:val="clear" w:color="auto" w:fill="auto"/>
-            <w:vAlign w:val="center"/>
-          </w:tcPr>
-          <w:p>
-            <w:r>
-              <w:t>How can I get only the validation page so I can place it on the institution's page?</w:t>
-            </w:r>
-          </w:p>
-        </w:tc>
-        <w:tc>
-          <w:tcPr>
-            <w:tcW w:w="4403" w:type="dxa"/>
-            <w:shd w:val="clear" w:color="auto" w:fill="auto"/>
-          </w:tcPr>
-          <w:p>
-            <w:pPr>
-              <w:jc w:val="center"/>
-            </w:pPr>
-            <w:r>
-              <w:t>DONE</w:t>
-            </w:r>
-          </w:p>
-          <w:p>
-            <w:pPr>
-              <w:jc w:val="center"/>
-            </w:pPr>
-            <w:r>
-              <w:t>I have prepared your iframe you can</w:t>
-            </w:r>
-          </w:p>
-          <w:p>
-            <w:pPr>
-              <w:jc w:val="center"/>
-            </w:pPr>
-            <w:r>
-              <w:t>embed it in the institution, or if you want to embed it yourself it's easy enough. create a new page to check the certificate and enter the iframe address https://testing.nazarethnet.com/certificate/start_iframe/</w:t>
-            </w:r>
-          </w:p>
-        </w:tc>
-      </w:tr>
-      <w:tr>
-        <w:tc>
-          <w:tcPr>
-            <w:tcW w:w="562" w:type="dxa"/>
-            <w:vAlign w:val="center"/>
-          </w:tcPr>
-          <w:p>
-            <w:pPr>
-              <w:jc w:val="center"/>
-            </w:pPr>
-            <w:r>
-              <w:t>17</w:t>
-            </w:r>
-          </w:p>
-        </w:tc>
-        <w:tc>
-          <w:tcPr>
-            <w:tcW w:w="5670" w:type="dxa"/>
-            <w:shd w:val="clear" w:color="auto" w:fill="auto"/>
-            <w:vAlign w:val="center"/>
-          </w:tcPr>
-          <w:p>
-            <w:r>
-              <w:t>Duplication must be allowed to be carried out between branches and between sections</w:t>
-            </w:r>
-          </w:p>
-        </w:tc>
-        <w:tc>
-          <w:tcPr>
-            <w:tcW w:w="4403" w:type="dxa"/>
-            <w:shd w:val="clear" w:color="auto" w:fill="auto"/>
-            <w:vAlign w:val="center"/>
-          </w:tcPr>
-          <w:p>
-            <w:pPr>
-              <w:jc w:val="center"/>
-            </w:pPr>
-            <w:r>
-              <w:t>DONE</w:t>
-            </w:r>
-          </w:p>
-        </w:tc>
-      </w:tr>
-      <w:tr>
-        <w:tc>
-          <w:tcPr>
-            <w:tcW w:w="562" w:type="dxa"/>
-            <w:vAlign w:val="center"/>
-          </w:tcPr>
-          <w:p>
-            <w:pPr>
-              <w:jc w:val="center"/>
-            </w:pPr>
-            <w:r>
-              <w:t>18</w:t>
-            </w:r>
-          </w:p>
-        </w:tc>
-        <w:tc>
-          <w:tcPr>
-            <w:tcW w:w="5670" w:type="dxa"/>
-            <w:shd w:val="clear" w:color="auto" w:fill="auto"/>
-            <w:vAlign w:val="center"/>
-          </w:tcPr>
-          <w:p>
-            <w:r>
-              <w:t>Add the fonts, emoticons and reactions feature here as well</w:t>
-            </w:r>
-          </w:p>
-          <w:p>
-            <w:r>
-              <w:t>http://testing.nazarethnet.com/admin/panel/</w:t>
-            </w:r>
-          </w:p>
-        </w:tc>
-        <w:tc>
-          <w:tcPr>
-            <w:tcW w:w="4403" w:type="dxa"/>
-            <w:shd w:val="clear" w:color="auto" w:fill="auto"/>
-            <w:vAlign w:val="center"/>
-          </w:tcPr>
-          <w:p>
-            <w:pPr>
-              <w:jc w:val="center"/>
-              <w:rPr>
-                <w:lang w:val="en-US"/>
-              </w:rPr>
-            </w:pPr>
-          </w:p>
-        </w:tc>
-      </w:tr>
-      <w:tr>
-        <w:tc>
-          <w:tcPr>
-            <w:tcW w:w="562" w:type="dxa"/>
-            <w:vAlign w:val="center"/>
-          </w:tcPr>
-          <w:p>
-            <w:pPr>
-              <w:jc w:val="center"/>
-            </w:pPr>
-            <w:r>
-              <w:t>19</w:t>
-            </w:r>
-          </w:p>
-        </w:tc>
-        <w:tc>
-          <w:tcPr>
-            <w:tcW w:w="5670" w:type="dxa"/>
-            <w:shd w:val="clear" w:color="auto" w:fill="auto"/>
-            <w:vAlign w:val="center"/>
-          </w:tcPr>
-          <w:p>
-            <w:r>
-              <w:t>THIS REACTION SHOULD BE A LITTLE BIGGER</w:t>
-            </w:r>
-          </w:p>
-        </w:tc>
-        <w:tc>
-          <w:tcPr>
-            <w:tcW w:w="4403" w:type="dxa"/>
-            <w:shd w:val="clear" w:color="auto" w:fill="auto"/>
-            <w:vAlign w:val="center"/>
-          </w:tcPr>
-          <w:p>
-            <w:pPr>
-              <w:jc w:val="center"/>
-            </w:pPr>
-            <w:r>
-              <w:t>DONE</w:t>
-            </w:r>
-          </w:p>
-        </w:tc>
-      </w:tr>
-      <w:tr>
-        <w:tc>
-          <w:tcPr>
-            <w:tcW w:w="562" w:type="dxa"/>
-            <w:vAlign w:val="center"/>
-          </w:tcPr>
-          <w:p>
-            <w:pPr>
-              <w:jc w:val="center"/>
-            </w:pPr>
-            <w:r>
-              <w:t>20</w:t>
-            </w:r>
-          </w:p>
-        </w:tc>
-        <w:tc>
-          <w:tcPr>
-            <w:tcW w:w="5670" w:type="dxa"/>
-            <w:shd w:val="clear" w:color="auto" w:fill="auto"/>
-            <w:vAlign w:val="center"/>
-          </w:tcPr>
-          <w:p>
-            <w:r>
-              <w:t>As a student user, you cannot answer exam questions. The following message appears</w:t>
-            </w:r>
-          </w:p>
-        </w:tc>
-        <w:tc>
-          <w:tcPr>
-            <w:tcW w:w="4403" w:type="dxa"/>
-            <w:shd w:val="clear" w:color="auto" w:fill="auto"/>
-            <w:vAlign w:val="center"/>
-          </w:tcPr>
-          <w:p>
-            <w:pPr>
-              <w:jc w:val="center"/>
-            </w:pPr>
-          </w:p>
-        </w:tc>
-      </w:tr>
-      <w:tr>
-        <w:tc>
-          <w:tcPr>
-            <w:tcW w:w="562" w:type="dxa"/>
-            <w:vAlign w:val="center"/>
-          </w:tcPr>
-          <w:p>
-            <w:pPr>
-              <w:jc w:val="center"/>
-            </w:pPr>
-            <w:r>
-              <w:t>21</w:t>
-            </w:r>
-          </w:p>
-        </w:tc>
-        <w:tc>
-          <w:tcPr>
-            <w:tcW w:w="5670" w:type="dxa"/>
-            <w:shd w:val="clear" w:color="auto" w:fill="auto"/>
-            <w:vAlign w:val="center"/>
-          </w:tcPr>
-          <w:p>
-            <w:r>
-              <w:t>With the student user, you can only see books from a single section. If the student has</w:t>
-            </w:r>
-          </w:p>
-          <w:p>
-            <w:r>
-              <w:t>more than two sections and courses active, they should see books from the sections they</w:t>
-            </w:r>
-          </w:p>
-          <w:p>
-            <w:r>
-              <w:t>have active.</w:t>
-            </w:r>
-          </w:p>
-        </w:tc>
-        <w:tc>
-          <w:tcPr>
-            <w:tcW w:w="4403" w:type="dxa"/>
-            <w:shd w:val="clear" w:color="auto" w:fill="auto"/>
-            <w:vAlign w:val="center"/>
-          </w:tcPr>
-          <w:p>
-            <w:pPr>
-              <w:jc w:val="center"/>
-              <w:rPr>
-                <w:lang w:val="en-US"/>
-              </w:rPr>
-            </w:pPr>
-            <w:r>
-              <w:rPr>
-                <w:lang w:val="en-US"/>
-              </w:rPr>
-              <w:t>DONE</w:t>
-            </w:r>
-          </w:p>
-        </w:tc>
-      </w:tr>
-      <w:tr>
-        <w:tc>
-          <w:tcPr>
-            <w:tcW w:w="562" w:type="dxa"/>
-            <w:vAlign w:val="center"/>
-          </w:tcPr>
-          <w:p>
-            <w:pPr>
-              <w:jc w:val="center"/>
-            </w:pPr>
-            <w:r>
-              <w:t>22</w:t>
-            </w:r>
-          </w:p>
-        </w:tc>
-        <w:tc>
-          <w:tcPr>
-            <w:tcW w:w="5670" w:type="dxa"/>
-            <w:shd w:val="clear" w:color="auto" w:fill="auto"/>
-            <w:vAlign w:val="center"/>
-          </w:tcPr>
-          <w:p>
-            <w:r>
-              <w:t>ERROR MESSAGE APPEARS WHEN CREATING THE REPORT</w:t>
-            </w:r>
-          </w:p>
-        </w:tc>
-        <w:tc>
-          <w:tcPr>
-            <w:tcW w:w="4403" w:type="dxa"/>
-            <w:shd w:val="clear" w:color="auto" w:fill="auto"/>
-            <w:vAlign w:val="center"/>
-          </w:tcPr>
-          <w:p>
-            <w:pPr>
-              <w:jc w:val="center"/>
-              <w:rPr>
-                <w:lang w:val="en-US"/>
-              </w:rPr>
-            </w:pPr>
-            <w:r>
-              <w:rPr>
-                <w:lang w:val="en-US"/>
-              </w:rPr>
-              <w:t>DONE</w:t>
-            </w:r>
-          </w:p>
-        </w:tc>
-      </w:tr>
-      <w:tr>
-        <w:tc>
-          <w:tcPr>
-            <w:tcW w:w="562" w:type="dxa"/>
-            <w:vAlign w:val="center"/>
-          </w:tcPr>
-          <w:p>
-            <w:pPr>
-              <w:jc w:val="center"/>
-            </w:pPr>
-            <w:r>
               <w:t>23</w:t>
             </w:r>
           </w:p>
@@ -1217,7 +1268,6 @@
           </w:p>
           <w:p>
             <w:r>
-              <w:lastRenderedPageBreak/>
               <w:t>Export student grades and attendance with date ranges should be added</w:t>
             </w:r>
           </w:p>
@@ -1233,7 +1283,6 @@
               <w:jc w:val="center"/>
             </w:pPr>
             <w:r>
-              <w:lastRenderedPageBreak/>
               <w:t>DONE</w:t>
             </w:r>
           </w:p>

</xml_diff>